<commit_message>
feat(LogLoader): add entries/knownIps loaders and progress event
</commit_message>
<xml_diff>
--- a/Dokumentace.docx
+++ b/Dokumentace.docx
@@ -561,7 +561,15 @@
                 <w:sz w:val="20"/>
                 <w:szCs w:val="20"/>
               </w:rPr>
-              <w:t>LoadFile</w:t>
+              <w:t>Load</w:t>
+            </w:r>
+            <w:r>
+              <w:rPr>
+                <w:rFonts w:ascii="Courier New" w:eastAsia="Courier New" w:hAnsi="Courier New" w:cs="Courier New"/>
+                <w:sz w:val="20"/>
+                <w:szCs w:val="20"/>
+              </w:rPr>
+              <w:t>Entries</w:t>
             </w:r>
             <w:proofErr w:type="spellEnd"/>
             <w:r>

</xml_diff>